<commit_message>
Add more documents and enhance html files using pandoc Word Document converter
</commit_message>
<xml_diff>
--- a/Eschatology-Final-Paper-Rothauser.docx
+++ b/Eschatology-Final-Paper-Rothauser.docx
@@ -10,20 +10,6 @@
           <w:szCs w:val="24"/>
         </w:rPr>
       </w:pPr>
-      <w:r>
-        <w:rPr>
-          <w:rFonts w:eastAsia="Calibri"/>
-          <w:szCs w:val="24"/>
-        </w:rPr>
-        <w:t>v</w:t>
-      </w:r>
-      <w:r>
-        <w:rPr>
-          <w:rFonts w:eastAsia="Calibri"/>
-          <w:szCs w:val="24"/>
-        </w:rPr>
-        <w:t xml:space="preserve"> </w:t>
-      </w:r>
       <w:r>
         <w:rPr>
           <w:rFonts w:eastAsia="Calibri"/>
@@ -401,7 +387,6 @@
         <w:dataBinding w:prefixMappings="xmlns:ns0='http://purl.org/dc/elements/1.1/' xmlns:ns1='http://schemas.openxmlformats.org/package/2006/metadata/core-properties' " w:xpath="/ns1:coreProperties[1]/ns0:creator[1]" w:storeItemID="{6C3C8BC8-F283-45AE-878A-BAB7291924A1}"/>
         <w:text/>
       </w:sdtPr>
-      <w:sdtEndPr/>
       <w:sdtContent>
         <w:p>
           <w:pPr>
@@ -712,7 +697,13 @@
         <w:t>,</w:t>
       </w:r>
       <w:r>
-        <w:t xml:space="preserve"> after which he will return </w:t>
+        <w:t xml:space="preserve"> </w:t>
+      </w:r>
+      <w:r>
+        <w:t>and then</w:t>
+      </w:r>
+      <w:r>
+        <w:t xml:space="preserve"> return </w:t>
       </w:r>
       <w:r>
         <w:t>to inaugurate the eternal state</w:t>
@@ -727,7 +718,10 @@
         <w:t xml:space="preserve">. </w:t>
       </w:r>
       <w:r>
-        <w:t>On the other end</w:t>
+        <w:t xml:space="preserve">On the other </w:t>
+      </w:r>
+      <w:r>
+        <w:t>end</w:t>
       </w:r>
       <w:r>
         <w:t xml:space="preserve">, liberal Christianity </w:t>
@@ -766,7 +760,19 @@
         <w:t>notion</w:t>
       </w:r>
       <w:r>
-        <w:t xml:space="preserve"> about the eschaton</w:t>
+        <w:t xml:space="preserve"> </w:t>
+      </w:r>
+      <w:r>
+        <w:t>of</w:t>
+      </w:r>
+      <w:r>
+        <w:t xml:space="preserve"> </w:t>
+      </w:r>
+      <w:r>
+        <w:t>an</w:t>
+      </w:r>
+      <w:r>
+        <w:t xml:space="preserve"> eschaton</w:t>
       </w:r>
       <w:r>
         <w:rPr>
@@ -796,10 +802,19 @@
         <w:t>positions</w:t>
       </w:r>
       <w:r>
-        <w:t xml:space="preserve"> in-between</w:t>
-      </w:r>
-      <w:r>
-        <w:t>, for example, the great tribulation mentioned in Matt. 24:21 and Revelation 7:14 are two separate events.</w:t>
+        <w:t xml:space="preserve"> </w:t>
+      </w:r>
+      <w:r>
+        <w:t>in between, for example, the great tribulation mentioned in Matt.</w:t>
+      </w:r>
+      <w:r>
+        <w:t xml:space="preserve"> 24:21 and Revelation 7:14 </w:t>
+      </w:r>
+      <w:r>
+        <w:t>describe</w:t>
+      </w:r>
+      <w:r>
+        <w:t xml:space="preserve"> two separate events.</w:t>
       </w:r>
       <w:r>
         <w:t xml:space="preserve"> </w:t>
@@ -823,7 +838,13 @@
         <w:t xml:space="preserve"> that </w:t>
       </w:r>
       <w:r>
-        <w:t>Jesus prophesized in the Olivet Discourse</w:t>
+        <w:t xml:space="preserve">Jesus </w:t>
+      </w:r>
+      <w:r>
+        <w:t>prophesied</w:t>
+      </w:r>
+      <w:r>
+        <w:t xml:space="preserve"> in the Olivet Discourse</w:t>
       </w:r>
       <w:r>
         <w:t xml:space="preserve"> (Matt. 24:21)</w:t>
@@ -853,7 +874,13 @@
         <w:footnoteReference w:id="5"/>
       </w:r>
       <w:r>
-        <w:t xml:space="preserve"> and that is not related to the great tribulation of Revelation 7:14</w:t>
+        <w:t xml:space="preserve"> and that </w:t>
+      </w:r>
+      <w:r>
+        <w:t xml:space="preserve">it </w:t>
+      </w:r>
+      <w:r>
+        <w:t>is not related to the great tribulation of Revelation 7:14</w:t>
       </w:r>
       <w:r>
         <w:rPr>
@@ -1328,7 +1355,6 @@
           <w:id w:val="1466312833"/>
           <w:citation/>
         </w:sdtPr>
-        <w:sdtEndPr/>
         <w:sdtContent>
           <w:r>
             <w:fldChar w:fldCharType="begin"/>
@@ -1987,7 +2013,6 @@
           <w:id w:val="1239211917"/>
           <w:citation/>
         </w:sdtPr>
-        <w:sdtEndPr/>
         <w:sdtContent>
           <w:r>
             <w:fldChar w:fldCharType="begin"/>
@@ -2049,7 +2074,6 @@
           <w:id w:val="2107534851"/>
           <w:citation/>
         </w:sdtPr>
-        <w:sdtEndPr/>
         <w:sdtContent>
           <w:r>
             <w:fldChar w:fldCharType="begin"/>
@@ -2129,7 +2153,6 @@
           <w:id w:val="1406255327"/>
           <w:citation/>
         </w:sdtPr>
-        <w:sdtEndPr/>
         <w:sdtContent>
           <w:r>
             <w:fldChar w:fldCharType="begin"/>
@@ -2211,7 +2234,6 @@
           <w:id w:val="-117148825"/>
           <w:citation/>
         </w:sdtPr>
-        <w:sdtEndPr/>
         <w:sdtContent>
           <w:r>
             <w:fldChar w:fldCharType="begin"/>
@@ -2301,7 +2323,6 @@
           <w:id w:val="897248365"/>
           <w:citation/>
         </w:sdtPr>
-        <w:sdtEndPr/>
         <w:sdtContent>
           <w:r>
             <w:fldChar w:fldCharType="begin"/>
@@ -2431,7 +2452,6 @@
           <w:id w:val="-1741159666"/>
           <w:citation/>
         </w:sdtPr>
-        <w:sdtEndPr/>
         <w:sdtContent>
           <w:r>
             <w:fldChar w:fldCharType="begin"/>
@@ -3767,7 +3787,6 @@
           <w:id w:val="1236900929"/>
           <w:citation/>
         </w:sdtPr>
-        <w:sdtEndPr/>
         <w:sdtContent>
           <w:r>
             <w:fldChar w:fldCharType="begin"/>
@@ -4031,7 +4050,6 @@
           <w:id w:val="-40831513"/>
           <w:citation/>
         </w:sdtPr>
-        <w:sdtEndPr/>
         <w:sdtContent>
           <w:r>
             <w:fldChar w:fldCharType="begin"/>
@@ -4324,7 +4342,6 @@
           <w:id w:val="-762459307"/>
           <w:citation/>
         </w:sdtPr>
-        <w:sdtEndPr/>
         <w:sdtContent>
           <w:r>
             <w:fldChar w:fldCharType="begin"/>
@@ -4598,7 +4615,6 @@
           <w:id w:val="-722753860"/>
           <w:citation/>
         </w:sdtPr>
-        <w:sdtEndPr/>
         <w:sdtContent>
           <w:r>
             <w:fldChar w:fldCharType="begin"/>
@@ -5052,7 +5068,6 @@
           <w:id w:val="1249853070"/>
           <w:citation/>
         </w:sdtPr>
-        <w:sdtEndPr/>
         <w:sdtContent>
           <w:r>
             <w:fldChar w:fldCharType="begin"/>
@@ -5219,7 +5234,6 @@
           <w:id w:val="-1969655518"/>
           <w:citation/>
         </w:sdtPr>
-        <w:sdtEndPr/>
         <w:sdtContent>
           <w:r>
             <w:fldChar w:fldCharType="begin"/>
@@ -5315,7 +5329,6 @@
           <w:id w:val="-1249656220"/>
           <w:citation/>
         </w:sdtPr>
-        <w:sdtEndPr/>
         <w:sdtContent>
           <w:r>
             <w:fldChar w:fldCharType="begin"/>
@@ -5480,7 +5493,6 @@
           <w:id w:val="-1956783596"/>
           <w:citation/>
         </w:sdtPr>
-        <w:sdtEndPr/>
         <w:sdtContent>
           <w:r>
             <w:fldChar w:fldCharType="begin"/>
@@ -5559,7 +5571,6 @@
           <w:id w:val="-884947754"/>
           <w:citation/>
         </w:sdtPr>
-        <w:sdtEndPr/>
         <w:sdtContent>
           <w:r>
             <w:fldChar w:fldCharType="begin"/>
@@ -6020,7 +6031,6 @@
           <w:docPartUnique/>
         </w:docPartObj>
       </w:sdtPr>
-      <w:sdtEndPr/>
       <w:sdtContent>
         <w:p>
           <w:pPr>
@@ -6038,7 +6048,6 @@
             <w:id w:val="111145805"/>
             <w:bibliography/>
           </w:sdtPr>
-          <w:sdtEndPr/>
           <w:sdtContent>
             <w:p>
               <w:pPr>
@@ -6636,7 +6645,6 @@
           <w:id w:val="1741129029"/>
           <w:citation/>
         </w:sdtPr>
-        <w:sdtEndPr/>
         <w:sdtContent>
           <w:r>
             <w:fldChar w:fldCharType="begin"/>
@@ -6887,7 +6895,6 @@
           <w:id w:val="103552479"/>
           <w:citation/>
         </w:sdtPr>
-        <w:sdtEndPr/>
         <w:sdtContent>
           <w:r>
             <w:fldChar w:fldCharType="begin"/>
@@ -7046,7 +7053,6 @@
           <w:id w:val="898095170"/>
           <w:citation/>
         </w:sdtPr>
-        <w:sdtEndPr/>
         <w:sdtContent>
           <w:r>
             <w:fldChar w:fldCharType="begin"/>
@@ -7178,7 +7184,6 @@
           <w:id w:val="332107162"/>
           <w:citation/>
         </w:sdtPr>
-        <w:sdtEndPr/>
         <w:sdtContent>
           <w:r>
             <w:fldChar w:fldCharType="begin"/>
@@ -7380,7 +7385,6 @@
           <w:id w:val="-749116238"/>
           <w:citation/>
         </w:sdtPr>
-        <w:sdtEndPr/>
         <w:sdtContent>
           <w:r>
             <w:fldChar w:fldCharType="begin"/>
@@ -7445,7 +7449,6 @@
           <w:id w:val="-843008158"/>
           <w:citation/>
         </w:sdtPr>
-        <w:sdtEndPr/>
         <w:sdtContent>
           <w:r>
             <w:fldChar w:fldCharType="begin"/>
@@ -12838,7 +12841,9 @@
     <w:rsid w:val="008B3604"/>
     <w:rsid w:val="008D7048"/>
     <w:rsid w:val="00951F44"/>
+    <w:rsid w:val="00953B96"/>
     <w:rsid w:val="009B3DC5"/>
+    <w:rsid w:val="00AE5A08"/>
     <w:rsid w:val="00BB158B"/>
     <w:rsid w:val="00C1465F"/>
     <w:rsid w:val="00C46D14"/>
@@ -12854,9 +12859,11 @@
     <w:rsid w:val="00E9374E"/>
     <w:rsid w:val="00EA4C9C"/>
     <w:rsid w:val="00EC1A5F"/>
+    <w:rsid w:val="00F45E55"/>
     <w:rsid w:val="00F71AB9"/>
     <w:rsid w:val="00F734FA"/>
     <w:rsid w:val="00FA56F3"/>
+    <w:rsid w:val="00FA6A5C"/>
   </w:rsids>
   <m:mathPr>
     <m:mathFont m:val="Cambria Math"/>

</xml_diff>